<commit_message>
Fix PostgreSQL table names and preserve lifetime history
</commit_message>
<xml_diff>
--- a/docs/NOFUNBOT_Audit_And_Stability_Plan_Updated.docx
+++ b/docs/NOFUNBOT_Audit_And_Stability_Plan_Updated.docx
@@ -30,9 +30,9 @@
       <w:r>
         <w:t>Baseline review: 27 September 2026 | Package 21.9.2</w:t>
         <w:br/>
-        <w:t>Implementation update: package 21.10.0-rc.1 from the supplied v203.2 ZIP</w:t>
+        <w:t>Current implementation: package 21.10.0-rc.2 with database table correction</w:t>
         <w:br/>
-        <w:t>Sections 1–25 preserve the baseline findings. Sections 26–28 record the implemented changes, evidence and remaining release gates. This is a release candidate, not a production stability certification.</w:t>
+        <w:t>Sections 1–25 preserve the baseline findings. Sections 26–28 record RC1; Section 29 corrects its database paths and records RC2 validation. This is a release candidate, not a production stability certification.</w:t>
       </w:r>
     </w:p>
     <w:p>
@@ -4057,6 +4057,114 @@
         <w:t>Production stability requires completing and proving the staging gate, then addressing automatic build recovery, a partial-failure repair interface, normalized history and outbox storage, legacy attribution, complete legacy permissions and broader end-to-end coverage of trade, event, season and import variants. Assign owners and retain evidence for each gate. The included release notes describe recovery boundaries; this document does not claim these open items are completed or that zero regressions can be guaranteed.</w:t>
       </w:r>
     </w:p>
+    <w:p>
+      <w:r>
+        <w:br w:type="page"/>
+      </w:r>
+    </w:p>
+    <w:p>
+      <w:pPr>
+        <w:pStyle w:val="Heading1"/>
+      </w:pPr>
+      <w:r>
+        <w:t>29 Database table alignment correction</w:t>
+      </w:r>
+    </w:p>
+    <w:p>
+      <w:pPr>
+        <w:pStyle w:val="Heading2"/>
+      </w:pPr>
+      <w:r>
+        <w:t>Defect found after the RC1 handoff</w:t>
+      </w:r>
+    </w:p>
+    <w:p>
+      <w:pPr>
+        <w:spacing w:after="100"/>
+      </w:pPr>
+      <w:r>
+        <w:rPr>
+          <w:sz w:val="20"/>
+        </w:rPr>
+        <w:t>RC1 was not ready for deployment through its full migration chain. Migration 20260318_v109_full_schema renames BotKv to bot_kv and QueueAudit to queue_audit, matching the Prisma model mappings. Several raw SQL paths and the new readiness gate still used the old mixed-case names. Passing the local fixture suite did not expose this database integration defect. RC2 corrects critical history storage, JSON compatibility storage, queue writes, import/export and readiness to use the canonical tables.</w:t>
+      </w:r>
+    </w:p>
+    <w:p>
+      <w:pPr>
+        <w:pStyle w:val="Heading2"/>
+      </w:pPr>
+      <w:r>
+        <w:t>Correction and retained records</w:t>
+      </w:r>
+    </w:p>
+    <w:p>
+      <w:pPr>
+        <w:spacing w:after="100"/>
+      </w:pPr>
+      <w:r>
+        <w:rPr>
+          <w:sz w:val="20"/>
+        </w:rPr>
+        <w:t>The db:bootstrap compatibility command now runs committed Prisma migrations instead of recreating incompatible legacy tables. An additive migration copies legacy BotKv records into bot_kv while retaining the source table. Matching duplicates are harmless; divergent JSON values for the same key stop migration before any overwrite. Historical migration files are unchanged. Existing QueueAudit records stay in the legacy table as an archive; new queue audit writes use queue_audit. Stop old writers before cutover and reconcile any conflicting keys against backups.</w:t>
+      </w:r>
+    </w:p>
+    <w:p>
+      <w:pPr>
+        <w:pStyle w:val="Heading2"/>
+      </w:pPr>
+      <w:r>
+        <w:t>Evidence from the running bot</w:t>
+      </w:r>
+    </w:p>
+    <w:p>
+      <w:pPr>
+        <w:spacing w:after="100"/>
+      </w:pPr>
+      <w:r>
+        <w:rPr>
+          <w:sz w:val="20"/>
+        </w:rPr>
+        <w:t>The supplied screenshots show Node 20.20.2, approximately 90 minutes of uptime, ./data and the old listActiveLeagues failure. GitHub main at 6178d125469612630f749b15971993ac2623c021 contains RC1, the circular-import correction and a Node 22 Dockerfile. This strongly suggests an old or differently built running deployment, but Railway logs and its deployed commit are needed to confirm. A reachable database with an unsuccessful schema probe does not prove every table is missing.</w:t>
+      </w:r>
+    </w:p>
+    <w:p>
+      <w:pPr>
+        <w:pStyle w:val="Heading2"/>
+      </w:pPr>
+      <w:r>
+        <w:t>Checks actually completed</w:t>
+      </w:r>
+    </w:p>
+    <w:p>
+      <w:pPr>
+        <w:spacing w:after="100"/>
+      </w:pPr>
+      <w:r>
+        <w:rPr>
+          <w:sz w:val="20"/>
+        </w:rPr>
+        <w:t>All 86 local checks passed, along with syntax and TypeScript configuration checks. All six migrations executed successfully in PGlite, an embedded PostgreSQL engine. Canonical table presence, legacy record preservation, repeat reconciliation, conflicting-value refusal and rollback passed. These checks do not replace networked PostgreSQL, Prisma-client integration, Redis/queue or live Discord staging. The expanded PostgreSQL integration test is included. GitHub denied write access with HTTP 403, so this hotfix was not pushed or deployed.</w:t>
+      </w:r>
+    </w:p>
+    <w:p>
+      <w:pPr>
+        <w:pStyle w:val="Heading2"/>
+      </w:pPr>
+      <w:r>
+        <w:t>Required recovery sequence</w:t>
+      </w:r>
+    </w:p>
+    <w:p>
+      <w:pPr>
+        <w:spacing w:after="100"/>
+      </w:pPr>
+      <w:r>
+        <w:rPr>
+          <w:sz w:val="20"/>
+        </w:rPr>
+        <w:t>Back up PostgreSQL and the existing JSON directory before replacing the running container. Test RC2 migrations against restored staging data, then verify schema readiness. Attach writable persistent storage at /data and set BOT_DATA_DIR=/data; existing ./data files do not move automatically. Use the repository Dockerfile, sh scripts/railway-start.sh and /ready healthcheck. The Railway pre-deploy command is npm run prisma:migrate:deploy &amp;&amp; npm run schema:check. Stop on an unbaselined database, unfinished migration or conflicting legacy keys; inspect the exact error before repair. Do not substitute db push, reset or guessed channel creation. Detailed instructions are in docs/V204_DATABASE_HOTFIX.md.</w:t>
+      </w:r>
+    </w:p>
     <w:sectPr>
       <w:footerReference w:type="default" r:id="rId9"/>
       <w:pgSz w:w="12240" w:h="15840"/>

</xml_diff>

<commit_message>
Stabilize league isolation and recovery in RC6
</commit_message>
<xml_diff>
--- a/docs/NOFUNBOT_Audit_And_Stability_Plan_Updated.docx
+++ b/docs/NOFUNBOT_Audit_And_Stability_Plan_Updated.docx
@@ -4083,10 +4083,7 @@
         <w:spacing w:after="100"/>
       </w:pPr>
       <w:r>
-        <w:rPr>
-          <w:sz w:val="20"/>
-        </w:rPr>
-        <w:t>RC1 was not ready for deployment through its full migration chain. Migration 20260318_v109_full_schema renames BotKv to bot_kv and QueueAudit to queue_audit, matching the Prisma model mappings. Several raw SQL paths and the new readiness gate still used the old mixed-case names. Passing the local fixture suite did not expose this database integration defect. RC2 corrects critical history storage, JSON compatibility storage, queue writes, import/export and readiness to use the canonical tables.</w:t>
+        <w:t>RC1 still used mixed-case BotKv and QueueAudit names in raw SQL after the full-schema migration renamed them to bot_kv and queue_audit. This made critical storage and readiness inconsistent with Prisma. RC2 aligns those paths. Local fixtures had not exercised the full database migration chain.</w:t>
       </w:r>
     </w:p>
     <w:p>
@@ -4102,10 +4099,7 @@
         <w:spacing w:after="100"/>
       </w:pPr>
       <w:r>
-        <w:rPr>
-          <w:sz w:val="20"/>
-        </w:rPr>
-        <w:t>The db:bootstrap compatibility command now runs committed Prisma migrations instead of recreating incompatible legacy tables. An additive migration copies legacy BotKv records into bot_kv while retaining the source table. Matching duplicates are harmless; divergent JSON values for the same key stop migration before any overwrite. Historical migration files are unchanged. Existing QueueAudit records stay in the legacy table as an archive; new queue audit writes use queue_audit. Stop old writers before cutover and reconcile any conflicting keys against backups.</w:t>
+        <w:t>The compatibility bootstrap runs committed Prisma migrations. An additive migration copies legacy BotKv records without deleting their source; divergent values for the same key stop the operation. Existing QueueAudit rows remain archived, and new writes use queue_audit. Stop old writers and resolve conflicts against backups before cutover.</w:t>
       </w:r>
     </w:p>
     <w:p>
@@ -4121,10 +4115,7 @@
         <w:spacing w:after="100"/>
       </w:pPr>
       <w:r>
-        <w:rPr>
-          <w:sz w:val="20"/>
-        </w:rPr>
-        <w:t>The supplied screenshots show Node 20.20.2, approximately 90 minutes of uptime, ./data and the old listActiveLeagues failure. GitHub main at 6178d125469612630f749b15971993ac2623c021 contains RC1, the circular-import correction and a Node 22 Dockerfile. This strongly suggests an old or differently built running deployment, but Railway logs and its deployed commit are needed to confirm. A reachable database with an unsuccessful schema probe does not prove every table is missing.</w:t>
+        <w:t>The running-bot screenshots showed Node 20.20.2, ./data and an old listActiveLeagues error. That suggests a stale or differently built deployment, pending confirmation from Railway logs and its deployed commit. A failed schema probe does not establish that every table is absent.</w:t>
       </w:r>
     </w:p>
     <w:p>
@@ -4140,10 +4131,7 @@
         <w:spacing w:after="100"/>
       </w:pPr>
       <w:r>
-        <w:rPr>
-          <w:sz w:val="20"/>
-        </w:rPr>
-        <w:t>All 86 local checks passed, along with syntax and TypeScript configuration checks. All six migrations executed successfully in PGlite, an embedded PostgreSQL engine. Canonical table presence, legacy record preservation, repeat reconciliation, conflicting-value refusal and rollback passed. These checks do not replace networked PostgreSQL, Prisma-client integration, Redis/queue or live Discord staging. The expanded PostgreSQL integration test is included. GitHub denied write access with HTTP 403, so this hotfix was not pushed or deployed.</w:t>
+        <w:t>The RC2 local suite, syntax and TypeScript configuration checks passed. Six migrations and preservation, conflict and rollback cases passed in embedded PGlite. Real PostgreSQL, Prisma-client, Redis and Discord staging remained untested at that handoff; GitHub write access was denied for the hotfix.</w:t>
       </w:r>
     </w:p>
     <w:p>
@@ -4159,10 +4147,25 @@
         <w:spacing w:after="100"/>
       </w:pPr>
       <w:r>
-        <w:rPr>
-          <w:sz w:val="20"/>
-        </w:rPr>
-        <w:t>Back up PostgreSQL and the existing JSON directory before replacing the running container. Test RC2 migrations against restored staging data, then verify schema readiness. Attach writable persistent storage at /data and set BOT_DATA_DIR=/data; existing ./data files do not move automatically. Use the repository Dockerfile, sh scripts/railway-start.sh and /ready healthcheck. The Railway pre-deploy command is npm run prisma:migrate:deploy &amp;&amp; npm run schema:check. Stop on an unbaselined database, unfinished migration or conflicting legacy keys; inspect the exact error before repair. Do not substitute db push, reset or guessed channel creation. Detailed instructions are in docs/V204_DATABASE_HOTFIX.md.</w:t>
+        <w:t>Back up PostgreSQL and JSON state. Test migrations on a restored staging database, attach a writable /data volume, and run the repository Dockerfile and /ready healthcheck. Use npm run prisma:migrate:deploy &amp;&amp; npm run schema:check as Railway predeploy. Stop and inspect unbaselined migrations or conflicting keys; do not substitute db push or guessed channel creation. See docs/V204_DATABASE_HOTFIX.md.</w:t>
+      </w:r>
+    </w:p>
+    <w:p>
+      <w:pPr>
+        <w:pStyle w:val="Heading1"/>
+      </w:pPr>
+      <w:r>
+        <w:t>30 Template and fallback correction</w:t>
+      </w:r>
+    </w:p>
+    <w:p>
+      <w:r>
+        <w:t>RC5 keeps ordinary league channel names and guarded template cleanup from RC4. Discord gives a member one native nickname per server, not one per category. The bot now preserves the profile or chosen server name, clears only identifiable old bot team/timezone nicknames, and shows the selected team in league-specific posts. A commissioner whose role is above the bot requires a manual admin change to clear an old nickname. New league and event roles have readable unique names, permit tagging, and carry no server-wide permissions. Active-check posting must succeed before its timer starts. Five missed checks remove only the selected league membership, never the member from the whole server. Community role and permission failures no longer report success. See docs/V204_COMMUNITY_IDENTITY_AND_WIRING_RC5.md.</w:t>
+      </w:r>
+    </w:p>
+    <w:p>
+      <w:r>
+        <w:t>The RC4 fallback scan covered 194 JavaScript files and identified nine corrected clusters plus remaining risk areas. RC5 traced 1,041 literal relative module connections across 195 JavaScript files with none unresolved. The command contract covers 116 definitions and 129 router cases; the full local test suite passes. These checks do not prove live Discord permissions, PostgreSQL, Redis or Railway behavior. Source findings, the exact fallback counts and staging tasks are in the two V204 audit addenda.</w:t>
       </w:r>
     </w:p>
     <w:sectPr>

</xml_diff>

<commit_message>
Guard configured storage directory in RC3
</commit_message>
<xml_diff>
--- a/docs/NOFUNBOT_Audit_And_Stability_Plan_Updated.docx
+++ b/docs/NOFUNBOT_Audit_And_Stability_Plan_Updated.docx
@@ -30,9 +30,9 @@
       <w:r>
         <w:t>Baseline review: 27 September 2026 | Package 21.9.2</w:t>
         <w:br/>
-        <w:t>Current implementation: package 21.10.0-rc.2 with database table correction</w:t>
+        <w:t>Implementation update: package 21.10.0-rc.1 from the supplied v203.2 ZIP</w:t>
         <w:br/>
-        <w:t>Sections 1–25 preserve the baseline findings. Sections 26–28 record RC1; Section 29 corrects its database paths and records RC2 validation. This is a release candidate, not a production stability certification.</w:t>
+        <w:t>Sections 1–25 preserve the baseline findings. Sections 26–28 record the implemented changes, evidence and remaining release gates. This is a release candidate, not a production stability certification.</w:t>
       </w:r>
     </w:p>
     <w:p>
@@ -4057,117 +4057,6 @@
         <w:t>Production stability requires completing and proving the staging gate, then addressing automatic build recovery, a partial-failure repair interface, normalized history and outbox storage, legacy attribution, complete legacy permissions and broader end-to-end coverage of trade, event, season and import variants. Assign owners and retain evidence for each gate. The included release notes describe recovery boundaries; this document does not claim these open items are completed or that zero regressions can be guaranteed.</w:t>
       </w:r>
     </w:p>
-    <w:p>
-      <w:r>
-        <w:br w:type="page"/>
-      </w:r>
-    </w:p>
-    <w:p>
-      <w:pPr>
-        <w:pStyle w:val="Heading1"/>
-      </w:pPr>
-      <w:r>
-        <w:t>29 Database table alignment correction</w:t>
-      </w:r>
-    </w:p>
-    <w:p>
-      <w:pPr>
-        <w:pStyle w:val="Heading2"/>
-      </w:pPr>
-      <w:r>
-        <w:t>Defect found after the RC1 handoff</w:t>
-      </w:r>
-    </w:p>
-    <w:p>
-      <w:pPr>
-        <w:spacing w:after="100"/>
-      </w:pPr>
-      <w:r>
-        <w:t>RC1 still used mixed-case BotKv and QueueAudit names in raw SQL after the full-schema migration renamed them to bot_kv and queue_audit. This made critical storage and readiness inconsistent with Prisma. RC2 aligns those paths. Local fixtures had not exercised the full database migration chain.</w:t>
-      </w:r>
-    </w:p>
-    <w:p>
-      <w:pPr>
-        <w:pStyle w:val="Heading2"/>
-      </w:pPr>
-      <w:r>
-        <w:t>Correction and retained records</w:t>
-      </w:r>
-    </w:p>
-    <w:p>
-      <w:pPr>
-        <w:spacing w:after="100"/>
-      </w:pPr>
-      <w:r>
-        <w:t>The compatibility bootstrap runs committed Prisma migrations. An additive migration copies legacy BotKv records without deleting their source; divergent values for the same key stop the operation. Existing QueueAudit rows remain archived, and new writes use queue_audit. Stop old writers and resolve conflicts against backups before cutover.</w:t>
-      </w:r>
-    </w:p>
-    <w:p>
-      <w:pPr>
-        <w:pStyle w:val="Heading2"/>
-      </w:pPr>
-      <w:r>
-        <w:t>Evidence from the running bot</w:t>
-      </w:r>
-    </w:p>
-    <w:p>
-      <w:pPr>
-        <w:spacing w:after="100"/>
-      </w:pPr>
-      <w:r>
-        <w:t>The running-bot screenshots showed Node 20.20.2, ./data and an old listActiveLeagues error. That suggests a stale or differently built deployment, pending confirmation from Railway logs and its deployed commit. A failed schema probe does not establish that every table is absent.</w:t>
-      </w:r>
-    </w:p>
-    <w:p>
-      <w:pPr>
-        <w:pStyle w:val="Heading2"/>
-      </w:pPr>
-      <w:r>
-        <w:t>Checks actually completed</w:t>
-      </w:r>
-    </w:p>
-    <w:p>
-      <w:pPr>
-        <w:spacing w:after="100"/>
-      </w:pPr>
-      <w:r>
-        <w:t>The RC2 local suite, syntax and TypeScript configuration checks passed. Six migrations and preservation, conflict and rollback cases passed in embedded PGlite. Real PostgreSQL, Prisma-client, Redis and Discord staging remained untested at that handoff; GitHub write access was denied for the hotfix.</w:t>
-      </w:r>
-    </w:p>
-    <w:p>
-      <w:pPr>
-        <w:pStyle w:val="Heading2"/>
-      </w:pPr>
-      <w:r>
-        <w:t>Required recovery sequence</w:t>
-      </w:r>
-    </w:p>
-    <w:p>
-      <w:pPr>
-        <w:spacing w:after="100"/>
-      </w:pPr>
-      <w:r>
-        <w:t>Back up PostgreSQL and JSON state. Test migrations on a restored staging database, attach a writable /data volume, and run the repository Dockerfile and /ready healthcheck. Use npm run prisma:migrate:deploy &amp;&amp; npm run schema:check as Railway predeploy. Stop and inspect unbaselined migrations or conflicting keys; do not substitute db push or guessed channel creation. See docs/V204_DATABASE_HOTFIX.md.</w:t>
-      </w:r>
-    </w:p>
-    <w:p>
-      <w:pPr>
-        <w:pStyle w:val="Heading1"/>
-      </w:pPr>
-      <w:r>
-        <w:t>30 Template and fallback correction</w:t>
-      </w:r>
-    </w:p>
-    <w:p>
-      <w:r>
-        <w:t>RC5 keeps ordinary league channel names and guarded template cleanup from RC4. Discord gives a member one native nickname per server, not one per category. The bot now preserves the profile or chosen server name, clears only identifiable old bot team/timezone nicknames, and shows the selected team in league-specific posts. A commissioner whose role is above the bot requires a manual admin change to clear an old nickname. New league and event roles have readable unique names, permit tagging, and carry no server-wide permissions. Active-check posting must succeed before its timer starts. Five missed checks remove only the selected league membership, never the member from the whole server. Community role and permission failures no longer report success. See docs/V204_COMMUNITY_IDENTITY_AND_WIRING_RC5.md.</w:t>
-      </w:r>
-    </w:p>
-    <w:p>
-      <w:r>
-        <w:t>The RC4 fallback scan covered 194 JavaScript files and identified nine corrected clusters plus remaining risk areas. RC5 traced 1,041 literal relative module connections across 195 JavaScript files with none unresolved. The command contract covers 116 definitions and 129 router cases; the full local test suite passes. These checks do not prove live Discord permissions, PostgreSQL, Redis or Railway behavior. Source findings, the exact fallback counts and staging tasks are in the two V204 audit addenda.</w:t>
-      </w:r>
-    </w:p>
     <w:sectPr>
       <w:footerReference w:type="default" r:id="rId9"/>
       <w:pgSz w:w="12240" w:h="15840"/>

</xml_diff>

<commit_message>
Release v204.7 Madden Connect, conversation intelligence, natural planner, and structure overhaul
</commit_message>
<xml_diff>
--- a/docs/NOFUNBOT_Audit_And_Stability_Plan_Updated.docx
+++ b/docs/NOFUNBOT_Audit_And_Stability_Plan_Updated.docx
@@ -30,9 +30,9 @@
       <w:r>
         <w:t>Baseline review: 27 September 2026 | Package 21.9.2</w:t>
         <w:br/>
-        <w:t>Implementation update: package 21.10.0-rc.1 from the supplied v203.2 ZIP</w:t>
+        <w:t>Current implementation: package 21.10.0-rc.2 with database table correction</w:t>
         <w:br/>
-        <w:t>Sections 1–25 preserve the baseline findings. Sections 26–28 record the implemented changes, evidence and remaining release gates. This is a release candidate, not a production stability certification.</w:t>
+        <w:t>Sections 1–25 preserve the baseline findings. Sections 26–28 record RC1; Section 29 corrects its database paths and records RC2 validation. This is a release candidate, not a production stability certification.</w:t>
       </w:r>
     </w:p>
     <w:p>
@@ -4057,6 +4057,117 @@
         <w:t>Production stability requires completing and proving the staging gate, then addressing automatic build recovery, a partial-failure repair interface, normalized history and outbox storage, legacy attribution, complete legacy permissions and broader end-to-end coverage of trade, event, season and import variants. Assign owners and retain evidence for each gate. The included release notes describe recovery boundaries; this document does not claim these open items are completed or that zero regressions can be guaranteed.</w:t>
       </w:r>
     </w:p>
+    <w:p>
+      <w:r>
+        <w:br w:type="page"/>
+      </w:r>
+    </w:p>
+    <w:p>
+      <w:pPr>
+        <w:pStyle w:val="Heading1"/>
+      </w:pPr>
+      <w:r>
+        <w:t>29 Database table alignment correction</w:t>
+      </w:r>
+    </w:p>
+    <w:p>
+      <w:pPr>
+        <w:pStyle w:val="Heading2"/>
+      </w:pPr>
+      <w:r>
+        <w:t>Defect found after the RC1 handoff</w:t>
+      </w:r>
+    </w:p>
+    <w:p>
+      <w:pPr>
+        <w:spacing w:after="100"/>
+      </w:pPr>
+      <w:r>
+        <w:t>RC1 still used mixed-case BotKv and QueueAudit names in raw SQL after the full-schema migration renamed them to bot_kv and queue_audit. This made critical storage and readiness inconsistent with Prisma. RC2 aligns those paths. Local fixtures had not exercised the full database migration chain.</w:t>
+      </w:r>
+    </w:p>
+    <w:p>
+      <w:pPr>
+        <w:pStyle w:val="Heading2"/>
+      </w:pPr>
+      <w:r>
+        <w:t>Correction and retained records</w:t>
+      </w:r>
+    </w:p>
+    <w:p>
+      <w:pPr>
+        <w:spacing w:after="100"/>
+      </w:pPr>
+      <w:r>
+        <w:t>The compatibility bootstrap runs committed Prisma migrations. An additive migration copies legacy BotKv records without deleting their source; divergent values for the same key stop the operation. Existing QueueAudit rows remain archived, and new writes use queue_audit. Stop old writers and resolve conflicts against backups before cutover.</w:t>
+      </w:r>
+    </w:p>
+    <w:p>
+      <w:pPr>
+        <w:pStyle w:val="Heading2"/>
+      </w:pPr>
+      <w:r>
+        <w:t>Evidence from the running bot</w:t>
+      </w:r>
+    </w:p>
+    <w:p>
+      <w:pPr>
+        <w:spacing w:after="100"/>
+      </w:pPr>
+      <w:r>
+        <w:t>The running-bot screenshots showed Node 20.20.2, ./data and an old listActiveLeagues error. That suggests a stale or differently built deployment, pending confirmation from Railway logs and its deployed commit. A failed schema probe does not establish that every table is absent.</w:t>
+      </w:r>
+    </w:p>
+    <w:p>
+      <w:pPr>
+        <w:pStyle w:val="Heading2"/>
+      </w:pPr>
+      <w:r>
+        <w:t>Checks actually completed</w:t>
+      </w:r>
+    </w:p>
+    <w:p>
+      <w:pPr>
+        <w:spacing w:after="100"/>
+      </w:pPr>
+      <w:r>
+        <w:t>The RC2 local suite, syntax and TypeScript configuration checks passed. Six migrations and preservation, conflict and rollback cases passed in embedded PGlite. Real PostgreSQL, Prisma-client, Redis and Discord staging remained untested at that handoff; GitHub write access was denied for the hotfix.</w:t>
+      </w:r>
+    </w:p>
+    <w:p>
+      <w:pPr>
+        <w:pStyle w:val="Heading2"/>
+      </w:pPr>
+      <w:r>
+        <w:t>Required recovery sequence</w:t>
+      </w:r>
+    </w:p>
+    <w:p>
+      <w:pPr>
+        <w:spacing w:after="100"/>
+      </w:pPr>
+      <w:r>
+        <w:t>Back up PostgreSQL and JSON state. Test migrations on a restored staging database, attach a writable /data volume, and run the repository Dockerfile and /ready healthcheck. Use npm run prisma:migrate:deploy &amp;&amp; npm run schema:check as Railway predeploy. Stop and inspect unbaselined migrations or conflicting keys; do not substitute db push or guessed channel creation. See docs/V204_DATABASE_HOTFIX.md.</w:t>
+      </w:r>
+    </w:p>
+    <w:p>
+      <w:pPr>
+        <w:pStyle w:val="Heading1"/>
+      </w:pPr>
+      <w:r>
+        <w:t>30 Template and fallback correction</w:t>
+      </w:r>
+    </w:p>
+    <w:p>
+      <w:r>
+        <w:t>RC5 keeps ordinary league channel names and guarded template cleanup from RC4. Discord gives a member one native nickname per server, not one per category. The bot now preserves the profile or chosen server name, clears only identifiable old bot team/timezone nicknames, and shows the selected team in league-specific posts. A commissioner whose role is above the bot requires a manual admin change to clear an old nickname. New league and event roles have readable unique names, permit tagging, and carry no server-wide permissions. Active-check posting must succeed before its timer starts. Five missed checks remove only the selected league membership, never the member from the whole server. Community role and permission failures no longer report success. See docs/V204_COMMUNITY_IDENTITY_AND_WIRING_RC5.md.</w:t>
+      </w:r>
+    </w:p>
+    <w:p>
+      <w:r>
+        <w:t>The RC4 fallback scan covered 194 JavaScript files and identified nine corrected clusters plus remaining risk areas. RC5 traced 1,041 literal relative module connections across 195 JavaScript files with none unresolved. The command contract covers 116 definitions and 129 router cases; the full local test suite passes. These checks do not prove live Discord permissions, PostgreSQL, Redis or Railway behavior. Source findings, the exact fallback counts and staging tasks are in the two V204 audit addenda.</w:t>
+      </w:r>
+    </w:p>
     <w:sectPr>
       <w:footerReference w:type="default" r:id="rId9"/>
       <w:pgSz w:w="12240" w:h="15840"/>

</xml_diff>